<commit_message>
docs: format reports for APA 7 and add course details
</commit_message>
<xml_diff>
--- a/documentation/Capstone_Report_Chapters_4_5_6.docx
+++ b/documentation/Capstone_Report_Chapters_4_5_6.docx
@@ -5,7 +5,48 @@
     <w:p>
       <w:pPr>
         <w:pStyle w:val="Title"/>
+        <w:spacing w:line="480" w:lineRule="auto" w:before="1800" w:after="0"/>
+        <w:jc w:val="center"/>
+      </w:pPr>
+      <w:r>
+        <w:rPr>
+          <w:b/>
+          <w:sz w:val="24"/>
+        </w:rPr>
+        <w:t>SafeSteps Capstone Project Report Chapters Four to Six</w:t>
+      </w:r>
+    </w:p>
+    <w:p>
+      <w:pPr>
         <w:spacing w:line="480" w:lineRule="auto"/>
+        <w:jc w:val="center"/>
+      </w:pPr>
+      <w:r>
+        <w:t>Desta Jomma</w:t>
+      </w:r>
+    </w:p>
+    <w:p>
+      <w:pPr>
+        <w:spacing w:line="480" w:lineRule="auto"/>
+        <w:jc w:val="center"/>
+      </w:pPr>
+      <w:r>
+        <w:t>MSIT 5910-01 - AY2027-T1</w:t>
+      </w:r>
+    </w:p>
+    <w:p>
+      <w:pPr>
+        <w:spacing w:line="480" w:lineRule="auto"/>
+        <w:jc w:val="center"/>
+      </w:pPr>
+      <w:r>
+        <w:br w:type="page"/>
+      </w:r>
+    </w:p>
+    <w:p>
+      <w:pPr>
+        <w:pStyle w:val="Title"/>
+        <w:spacing w:line="480" w:lineRule="auto" w:before="0" w:after="0"/>
         <w:jc w:val="center"/>
       </w:pPr>
       <w:r>
@@ -106,6 +147,28 @@
     </w:p>
     <w:p>
       <w:pPr>
+        <w:spacing w:line="240" w:lineRule="auto"/>
+        <w:jc w:val="left"/>
+      </w:pPr>
+      <w:r>
+        <w:rPr>
+          <w:rFonts w:ascii="Times New Roman" w:hAnsi="Times New Roman"/>
+          <w:b/>
+          <w:sz w:val="24"/>
+        </w:rPr>
+        <w:t>Figure 4.1.</w:t>
+      </w:r>
+      <w:r>
+        <w:rPr>
+          <w:rFonts w:ascii="Times New Roman" w:hAnsi="Times New Roman"/>
+          <w:i/>
+          <w:sz w:val="24"/>
+        </w:rPr>
+        <w:t xml:space="preserve"> Core score function and allowlist predicates from source_code/app.py.</w:t>
+      </w:r>
+    </w:p>
+    <w:p>
+      <w:pPr>
         <w:spacing w:line="480" w:lineRule="auto"/>
         <w:jc w:val="center"/>
       </w:pPr>
@@ -151,20 +214,6 @@
     <w:p>
       <w:pPr>
         <w:spacing w:line="480" w:lineRule="auto"/>
-        <w:jc w:val="center"/>
-      </w:pPr>
-      <w:r>
-        <w:rPr>
-          <w:rFonts w:ascii="Times New Roman" w:hAnsi="Times New Roman" w:eastAsia="Times New Roman"/>
-          <w:i/>
-          <w:sz w:val="24"/>
-        </w:rPr>
-        <w:t>Figure 4.1. Core score function and allowlist predicates from source_code/app.py.</w:t>
-      </w:r>
-    </w:p>
-    <w:p>
-      <w:pPr>
-        <w:spacing w:line="480" w:lineRule="auto"/>
         <w:ind w:firstLine="720"/>
       </w:pPr>
       <w:r>
@@ -173,6 +222,28 @@
           <w:sz w:val="24"/>
         </w:rPr>
         <w:t>The score then moves through an integrated request path. The employee submits a form with the session-specific CSRF value and three selected answers. The handler parses the form, resolves the active user from a hashed session identifier, confirms employee role, checks the CSRF token using constant-time comparison, validates choices, calls the scoring helper, and inserts score and total using parameterized SQL. A separate audit row records the submission. The handler commits the transaction and redirects to a page that displays the result. A follow-up database query verified that the row held score 3 and total 3 for the sample input. This path joins browser input, role and session controls, business logic, persistence, and output feedback.</w:t>
+      </w:r>
+    </w:p>
+    <w:p>
+      <w:pPr>
+        <w:spacing w:line="240" w:lineRule="auto"/>
+        <w:jc w:val="left"/>
+      </w:pPr>
+      <w:r>
+        <w:rPr>
+          <w:rFonts w:ascii="Times New Roman" w:hAnsi="Times New Roman"/>
+          <w:b/>
+          <w:sz w:val="24"/>
+        </w:rPr>
+        <w:t>Figure 4.2.</w:t>
+      </w:r>
+      <w:r>
+        <w:rPr>
+          <w:rFonts w:ascii="Times New Roman" w:hAnsi="Times New Roman"/>
+          <w:i/>
+          <w:sz w:val="24"/>
+        </w:rPr>
+        <w:t xml:space="preserve"> Authenticated HTTP handler linking assessment logic and SQLite persistence.</w:t>
       </w:r>
     </w:p>
     <w:p>
@@ -221,16 +292,24 @@
     </w:p>
     <w:p>
       <w:pPr>
-        <w:spacing w:line="480" w:lineRule="auto"/>
-        <w:jc w:val="center"/>
+        <w:spacing w:line="240" w:lineRule="auto"/>
+        <w:jc w:val="left"/>
       </w:pPr>
       <w:r>
         <w:rPr>
-          <w:rFonts w:ascii="Times New Roman" w:hAnsi="Times New Roman" w:eastAsia="Times New Roman"/>
+          <w:rFonts w:ascii="Times New Roman" w:hAnsi="Times New Roman"/>
+          <w:b/>
+          <w:sz w:val="24"/>
+        </w:rPr>
+        <w:t>Figure 4.3.</w:t>
+      </w:r>
+      <w:r>
+        <w:rPr>
+          <w:rFonts w:ascii="Times New Roman" w:hAnsi="Times New Roman"/>
           <w:i/>
           <w:sz w:val="24"/>
         </w:rPr>
-        <w:t>Figure 4.2. Authenticated HTTP handler linking assessment logic and SQLite persistence.</w:t>
+        <w:t xml:space="preserve"> Local route sequence and database verification for one synthetic learner.</w:t>
       </w:r>
     </w:p>
     <w:p>
@@ -275,20 +354,6 @@
             </a:graphic>
           </wp:inline>
         </w:drawing>
-      </w:r>
-    </w:p>
-    <w:p>
-      <w:pPr>
-        <w:spacing w:line="480" w:lineRule="auto"/>
-        <w:jc w:val="center"/>
-      </w:pPr>
-      <w:r>
-        <w:rPr>
-          <w:rFonts w:ascii="Times New Roman" w:hAnsi="Times New Roman" w:eastAsia="Times New Roman"/>
-          <w:i/>
-          <w:sz w:val="24"/>
-        </w:rPr>
-        <w:t>Figure 4.3. Local route sequence and database verification for one synthetic learner.</w:t>
       </w:r>
     </w:p>
     <w:p>
@@ -424,6 +489,28 @@
     </w:p>
     <w:p>
       <w:pPr>
+        <w:spacing w:line="240" w:lineRule="auto"/>
+        <w:jc w:val="left"/>
+      </w:pPr>
+      <w:r>
+        <w:rPr>
+          <w:rFonts w:ascii="Times New Roman" w:hAnsi="Times New Roman"/>
+          <w:b/>
+          <w:sz w:val="24"/>
+        </w:rPr>
+        <w:t>Figure 4.4.</w:t>
+      </w:r>
+      <w:r>
+        <w:rPr>
+          <w:rFonts w:ascii="Times New Roman" w:hAnsi="Times New Roman"/>
+          <w:i/>
+          <w:sz w:val="24"/>
+        </w:rPr>
+        <w:t xml:space="preserve"> Captured output of the isolated local performance run.</w:t>
+      </w:r>
+    </w:p>
+    <w:p>
+      <w:pPr>
         <w:spacing w:line="480" w:lineRule="auto"/>
         <w:jc w:val="center"/>
       </w:pPr>
@@ -468,16 +555,24 @@
     </w:p>
     <w:p>
       <w:pPr>
-        <w:spacing w:line="480" w:lineRule="auto"/>
-        <w:jc w:val="center"/>
+        <w:spacing w:line="240" w:lineRule="auto"/>
+        <w:jc w:val="left"/>
       </w:pPr>
       <w:r>
         <w:rPr>
-          <w:rFonts w:ascii="Times New Roman" w:hAnsi="Times New Roman" w:eastAsia="Times New Roman"/>
+          <w:rFonts w:ascii="Times New Roman" w:hAnsi="Times New Roman"/>
+          <w:b/>
+          <w:sz w:val="24"/>
+        </w:rPr>
+        <w:t>Figure 4.5.</w:t>
+      </w:r>
+      <w:r>
+        <w:rPr>
+          <w:rFonts w:ascii="Times New Roman" w:hAnsi="Times New Roman"/>
           <w:i/>
           <w:sz w:val="24"/>
         </w:rPr>
-        <w:t>Figure 4.4. Captured output of the isolated local performance run.</w:t>
+        <w:t xml:space="preserve"> Sequential and concurrent page latency using measured local values.</w:t>
       </w:r>
     </w:p>
     <w:p>
@@ -526,16 +621,28 @@
     </w:p>
     <w:p>
       <w:pPr>
-        <w:spacing w:line="480" w:lineRule="auto"/>
-        <w:jc w:val="center"/>
+        <w:spacing w:line="480" w:lineRule="auto" w:after="0"/>
       </w:pPr>
       <w:r>
         <w:rPr>
-          <w:rFonts w:ascii="Times New Roman" w:hAnsi="Times New Roman" w:eastAsia="Times New Roman"/>
+          <w:rFonts w:ascii="Times New Roman" w:hAnsi="Times New Roman"/>
           <w:i/>
           <w:sz w:val="24"/>
         </w:rPr>
-        <w:t>Figure 4.5. Sequential and concurrent page latency using measured local values.</w:t>
+        <w:t>Summary of quantitative and functional results</w:t>
+      </w:r>
+    </w:p>
+    <w:p>
+      <w:pPr>
+        <w:spacing w:line="480" w:lineRule="auto" w:after="0"/>
+      </w:pPr>
+      <w:r>
+        <w:rPr>
+          <w:rFonts w:ascii="Times New Roman" w:hAnsi="Times New Roman"/>
+          <w:b/>
+          <w:sz w:val="24"/>
+        </w:rPr>
+        <w:t>Table 1</w:t>
       </w:r>
     </w:p>
     <w:tbl>
@@ -544,6 +651,14 @@
         <w:tblW w:type="auto" w:w="0"/>
         <w:jc w:val="center"/>
         <w:tblLook w:firstColumn="1" w:firstRow="1" w:lastColumn="0" w:lastRow="0" w:noHBand="0" w:noVBand="1" w:val="04A0"/>
+        <w:tblBorders>
+          <w:top w:val="single" w:sz="8" w:color="000000"/>
+          <w:left w:val="nil"/>
+          <w:bottom w:val="single" w:sz="8" w:color="000000"/>
+          <w:right w:val="nil"/>
+          <w:insideH w:val="nil"/>
+          <w:insideV w:val="nil"/>
+        </w:tblBorders>
       </w:tblPr>
       <w:tblGrid>
         <w:gridCol w:w="2340"/>
@@ -555,6 +670,9 @@
         <w:tc>
           <w:tcPr>
             <w:tcW w:type="dxa" w:w="2340"/>
+            <w:tcBorders>
+              <w:bottom w:val="single" w:sz="6" w:color="000000"/>
+            </w:tcBorders>
           </w:tcPr>
           <w:p>
             <w:pPr>
@@ -564,7 +682,8 @@
               <w:rPr>
                 <w:rFonts w:ascii="Times New Roman" w:hAnsi="Times New Roman"/>
                 <w:b/>
-                <w:sz w:val="18"/>
+                <w:color w:val="000000"/>
+                <w:sz w:val="20"/>
               </w:rPr>
               <w:t>Metric</w:t>
             </w:r>
@@ -573,6 +692,9 @@
         <w:tc>
           <w:tcPr>
             <w:tcW w:type="dxa" w:w="2340"/>
+            <w:tcBorders>
+              <w:bottom w:val="single" w:sz="6" w:color="000000"/>
+            </w:tcBorders>
           </w:tcPr>
           <w:p>
             <w:pPr>
@@ -582,7 +704,8 @@
               <w:rPr>
                 <w:rFonts w:ascii="Times New Roman" w:hAnsi="Times New Roman"/>
                 <w:b/>
-                <w:sz w:val="18"/>
+                <w:color w:val="000000"/>
+                <w:sz w:val="20"/>
               </w:rPr>
               <w:t>Workload and sample</w:t>
             </w:r>
@@ -591,6 +714,9 @@
         <w:tc>
           <w:tcPr>
             <w:tcW w:type="dxa" w:w="2340"/>
+            <w:tcBorders>
+              <w:bottom w:val="single" w:sz="6" w:color="000000"/>
+            </w:tcBorders>
           </w:tcPr>
           <w:p>
             <w:pPr>
@@ -600,7 +726,8 @@
               <w:rPr>
                 <w:rFonts w:ascii="Times New Roman" w:hAnsi="Times New Roman"/>
                 <w:b/>
-                <w:sz w:val="18"/>
+                <w:color w:val="000000"/>
+                <w:sz w:val="20"/>
               </w:rPr>
               <w:t>Result</w:t>
             </w:r>
@@ -609,6 +736,9 @@
         <w:tc>
           <w:tcPr>
             <w:tcW w:type="dxa" w:w="2340"/>
+            <w:tcBorders>
+              <w:bottom w:val="single" w:sz="6" w:color="000000"/>
+            </w:tcBorders>
           </w:tcPr>
           <w:p>
             <w:pPr>
@@ -618,7 +748,8 @@
               <w:rPr>
                 <w:rFonts w:ascii="Times New Roman" w:hAnsi="Times New Roman"/>
                 <w:b/>
-                <w:sz w:val="18"/>
+                <w:color w:val="000000"/>
+                <w:sz w:val="20"/>
               </w:rPr>
               <w:t>Interpretation</w:t>
             </w:r>
@@ -638,7 +769,8 @@
               <w:rPr>
                 <w:rFonts w:ascii="Times New Roman" w:hAnsi="Times New Roman"/>
                 <w:b w:val="0"/>
-                <w:sz w:val="18"/>
+                <w:color w:val="000000"/>
+                <w:sz w:val="20"/>
               </w:rPr>
               <w:t>Sequential latency</w:t>
             </w:r>
@@ -656,7 +788,8 @@
               <w:rPr>
                 <w:rFonts w:ascii="Times New Roman" w:hAnsi="Times New Roman"/>
                 <w:b w:val="0"/>
-                <w:sz w:val="18"/>
+                <w:color w:val="000000"/>
+                <w:sz w:val="20"/>
               </w:rPr>
               <w:t>100 GET after 10 warmups</w:t>
             </w:r>
@@ -674,7 +807,8 @@
               <w:rPr>
                 <w:rFonts w:ascii="Times New Roman" w:hAnsi="Times New Roman"/>
                 <w:b w:val="0"/>
-                <w:sz w:val="18"/>
+                <w:color w:val="000000"/>
+                <w:sz w:val="20"/>
               </w:rPr>
               <w:t>Median 16.16 ms; p95 30.59 ms</w:t>
             </w:r>
@@ -692,7 +826,8 @@
               <w:rPr>
                 <w:rFonts w:ascii="Times New Roman" w:hAnsi="Times New Roman"/>
                 <w:b w:val="0"/>
-                <w:sz w:val="18"/>
+                <w:color w:val="000000"/>
+                <w:sz w:val="20"/>
               </w:rPr>
               <w:t>Local responsiveness</w:t>
             </w:r>
@@ -712,7 +847,8 @@
               <w:rPr>
                 <w:rFonts w:ascii="Times New Roman" w:hAnsi="Times New Roman"/>
                 <w:b w:val="0"/>
-                <w:sz w:val="18"/>
+                <w:color w:val="000000"/>
+                <w:sz w:val="20"/>
               </w:rPr>
               <w:t>Concurrent latency</w:t>
             </w:r>
@@ -730,7 +866,8 @@
               <w:rPr>
                 <w:rFonts w:ascii="Times New Roman" w:hAnsi="Times New Roman"/>
                 <w:b w:val="0"/>
-                <w:sz w:val="18"/>
+                <w:color w:val="000000"/>
+                <w:sz w:val="20"/>
               </w:rPr>
               <w:t>200 GET; 8 workers</w:t>
             </w:r>
@@ -748,7 +885,8 @@
               <w:rPr>
                 <w:rFonts w:ascii="Times New Roman" w:hAnsi="Times New Roman"/>
                 <w:b w:val="0"/>
-                <w:sz w:val="18"/>
+                <w:color w:val="000000"/>
+                <w:sz w:val="20"/>
               </w:rPr>
               <w:t>Median 6.98 ms; p95 8.32 ms</w:t>
             </w:r>
@@ -766,7 +904,8 @@
               <w:rPr>
                 <w:rFonts w:ascii="Times New Roman" w:hAnsi="Times New Roman"/>
                 <w:b w:val="0"/>
-                <w:sz w:val="18"/>
+                <w:color w:val="000000"/>
+                <w:sz w:val="20"/>
               </w:rPr>
               <w:t>No errors in short burst</w:t>
             </w:r>
@@ -786,7 +925,8 @@
               <w:rPr>
                 <w:rFonts w:ascii="Times New Roman" w:hAnsi="Times New Roman"/>
                 <w:b w:val="0"/>
-                <w:sz w:val="18"/>
+                <w:color w:val="000000"/>
+                <w:sz w:val="20"/>
               </w:rPr>
               <w:t>Successful responses</w:t>
             </w:r>
@@ -804,7 +944,8 @@
               <w:rPr>
                 <w:rFonts w:ascii="Times New Roman" w:hAnsi="Times New Roman"/>
                 <w:b w:val="0"/>
-                <w:sz w:val="18"/>
+                <w:color w:val="000000"/>
+                <w:sz w:val="20"/>
               </w:rPr>
               <w:t>All measured GETs</w:t>
             </w:r>
@@ -822,7 +963,8 @@
               <w:rPr>
                 <w:rFonts w:ascii="Times New Roman" w:hAnsi="Times New Roman"/>
                 <w:b w:val="0"/>
-                <w:sz w:val="18"/>
+                <w:color w:val="000000"/>
+                <w:sz w:val="20"/>
               </w:rPr>
               <w:t>300 of 300 HTTP 200</w:t>
             </w:r>
@@ -840,7 +982,8 @@
               <w:rPr>
                 <w:rFonts w:ascii="Times New Roman" w:hAnsi="Times New Roman"/>
                 <w:b w:val="0"/>
-                <w:sz w:val="18"/>
+                <w:color w:val="000000"/>
+                <w:sz w:val="20"/>
               </w:rPr>
               <w:t>Completed test requests</w:t>
             </w:r>
@@ -860,7 +1003,8 @@
               <w:rPr>
                 <w:rFonts w:ascii="Times New Roman" w:hAnsi="Times New Roman"/>
                 <w:b w:val="0"/>
-                <w:sz w:val="18"/>
+                <w:color w:val="000000"/>
+                <w:sz w:val="20"/>
               </w:rPr>
               <w:t>Throughput</w:t>
             </w:r>
@@ -878,7 +1022,8 @@
               <w:rPr>
                 <w:rFonts w:ascii="Times New Roman" w:hAnsi="Times New Roman"/>
                 <w:b w:val="0"/>
-                <w:sz w:val="18"/>
+                <w:color w:val="000000"/>
+                <w:sz w:val="20"/>
               </w:rPr>
               <w:t>200 requests in 0.180 sec</w:t>
             </w:r>
@@ -896,7 +1041,8 @@
               <w:rPr>
                 <w:rFonts w:ascii="Times New Roman" w:hAnsi="Times New Roman"/>
                 <w:b w:val="0"/>
-                <w:sz w:val="18"/>
+                <w:color w:val="000000"/>
+                <w:sz w:val="20"/>
               </w:rPr>
               <w:t>1,109.44 requests/sec</w:t>
             </w:r>
@@ -914,7 +1060,8 @@
               <w:rPr>
                 <w:rFonts w:ascii="Times New Roman" w:hAnsi="Times New Roman"/>
                 <w:b w:val="0"/>
-                <w:sz w:val="18"/>
+                <w:color w:val="000000"/>
+                <w:sz w:val="20"/>
               </w:rPr>
               <w:t>Local burst only</w:t>
             </w:r>
@@ -934,7 +1081,8 @@
               <w:rPr>
                 <w:rFonts w:ascii="Times New Roman" w:hAnsi="Times New Roman"/>
                 <w:b w:val="0"/>
-                <w:sz w:val="18"/>
+                <w:color w:val="000000"/>
+                <w:sz w:val="20"/>
               </w:rPr>
               <w:t>Assessment output</w:t>
             </w:r>
@@ -952,7 +1100,8 @@
               <w:rPr>
                 <w:rFonts w:ascii="Times New Roman" w:hAnsi="Times New Roman"/>
                 <w:b w:val="0"/>
-                <w:sz w:val="18"/>
+                <w:color w:val="000000"/>
+                <w:sz w:val="20"/>
               </w:rPr>
               <w:t>One valid submission</w:t>
             </w:r>
@@ -970,7 +1119,8 @@
               <w:rPr>
                 <w:rFonts w:ascii="Times New Roman" w:hAnsi="Times New Roman"/>
                 <w:b w:val="0"/>
-                <w:sz w:val="18"/>
+                <w:color w:val="000000"/>
+                <w:sz w:val="20"/>
               </w:rPr>
               <w:t>3/3 persisted</w:t>
             </w:r>
@@ -988,7 +1138,8 @@
               <w:rPr>
                 <w:rFonts w:ascii="Times New Roman" w:hAnsi="Times New Roman"/>
                 <w:b w:val="0"/>
-                <w:sz w:val="18"/>
+                <w:color w:val="000000"/>
+                <w:sz w:val="20"/>
               </w:rPr>
               <w:t>Sample functional correctness</w:t>
             </w:r>
@@ -1046,6 +1197,28 @@
     </w:p>
     <w:p>
       <w:pPr>
+        <w:spacing w:line="240" w:lineRule="auto"/>
+        <w:jc w:val="left"/>
+      </w:pPr>
+      <w:r>
+        <w:rPr>
+          <w:rFonts w:ascii="Times New Roman" w:hAnsi="Times New Roman"/>
+          <w:b/>
+          <w:sz w:val="24"/>
+        </w:rPr>
+        <w:t>Figure 4.6.</w:t>
+      </w:r>
+      <w:r>
+        <w:rPr>
+          <w:rFonts w:ascii="Times New Roman" w:hAnsi="Times New Roman"/>
+          <w:i/>
+          <w:sz w:val="24"/>
+        </w:rPr>
+        <w:t xml:space="preserve"> Employee interface content transcribed from the running application; heuristic inspection.</w:t>
+      </w:r>
+    </w:p>
+    <w:p>
+      <w:pPr>
         <w:spacing w:line="480" w:lineRule="auto"/>
         <w:jc w:val="center"/>
       </w:pPr>
@@ -1086,20 +1259,6 @@
             </a:graphic>
           </wp:inline>
         </w:drawing>
-      </w:r>
-    </w:p>
-    <w:p>
-      <w:pPr>
-        <w:spacing w:line="480" w:lineRule="auto"/>
-        <w:jc w:val="center"/>
-      </w:pPr>
-      <w:r>
-        <w:rPr>
-          <w:rFonts w:ascii="Times New Roman" w:hAnsi="Times New Roman" w:eastAsia="Times New Roman"/>
-          <w:i/>
-          <w:sz w:val="24"/>
-        </w:rPr>
-        <w:t>Figure 4.6. Employee interface content transcribed from the running application; heuristic inspection.</w:t>
       </w:r>
     </w:p>
     <w:p>
@@ -1703,6 +1862,7 @@
     <w:p>
       <w:pPr>
         <w:pStyle w:val="Heading1"/>
+        <w:pageBreakBefore/>
         <w:spacing w:line="480" w:lineRule="auto"/>
       </w:pPr>
       <w:r>
@@ -2031,13 +2191,36 @@
       </w:hyperlink>
     </w:p>
     <w:sectPr>
+      <w:headerReference w:type="default" r:id="rId28"/>
       <w:pgSz w:w="12240" w:h="15840"/>
-      <w:pgMar w:top="1152" w:right="1440" w:bottom="1152" w:left="1440" w:header="720" w:footer="720" w:gutter="0"/>
+      <w:pgMar w:top="1440" w:right="1440" w:bottom="1440" w:left="1440" w:header="720" w:footer="720" w:gutter="0"/>
       <w:cols w:space="720"/>
       <w:docGrid w:linePitch="360"/>
     </w:sectPr>
   </w:body>
 </w:document>
+</file>
+
+<file path=word/header1.xml><?xml version="1.0" encoding="utf-8"?>
+<w:hdr xmlns:m="http://schemas.openxmlformats.org/officeDocument/2006/math" xmlns:mc="http://schemas.openxmlformats.org/markup-compatibility/2006" xmlns:mo="http://schemas.microsoft.com/office/mac/office/2008/main" xmlns:mv="urn:schemas-microsoft-com:mac:vml" xmlns:o="urn:schemas-microsoft-com:office:office" xmlns:r="http://schemas.openxmlformats.org/officeDocument/2006/relationships" xmlns:v="urn:schemas-microsoft-com:vml" xmlns:w10="urn:schemas-microsoft-com:office:word" xmlns:w14="http://schemas.microsoft.com/office/word/2010/wordml" xmlns:w="http://schemas.openxmlformats.org/wordprocessingml/2006/main" xmlns:wne="http://schemas.microsoft.com/office/word/2006/wordml" xmlns:wp14="http://schemas.microsoft.com/office/word/2010/wordprocessingDrawing" xmlns:wp="http://schemas.openxmlformats.org/drawingml/2006/wordprocessingDrawing" xmlns:wpc="http://schemas.microsoft.com/office/word/2010/wordprocessingCanvas" xmlns:wpg="http://schemas.microsoft.com/office/word/2010/wordprocessingGroup" xmlns:wpi="http://schemas.microsoft.com/office/word/2010/wordprocessingInk" xmlns:wps="http://schemas.microsoft.com/office/word/2010/wordprocessingShape" mc:Ignorable="w14 wp14">
+  <w:p>
+    <w:pPr>
+      <w:pStyle w:val="Header"/>
+      <w:jc w:val="right"/>
+    </w:pPr>
+    <w:r>
+      <w:rPr>
+        <w:rFonts w:ascii="Times New Roman" w:hAnsi="Times New Roman"/>
+        <w:sz w:val="24"/>
+      </w:rPr>
+      <w:fldChar w:fldCharType="begin"/>
+      <w:instrText xml:space="preserve"> PAGE </w:instrText>
+      <w:fldChar w:fldCharType="separate"/>
+      <w:t>1</w:t>
+      <w:fldChar w:fldCharType="end"/>
+    </w:r>
+  </w:p>
+</w:hdr>
 </file>
 
 <file path=word/numbering.xml><?xml version="1.0" encoding="utf-8"?>
@@ -2468,14 +2651,15 @@
       <w:keepNext/>
       <w:keepLines/>
       <w:spacing w:before="480" w:after="0" w:line="480" w:lineRule="auto"/>
+      <w:jc w:val="center"/>
       <w:outlineLvl w:val="0"/>
     </w:pPr>
     <w:rPr>
       <w:rFonts w:asciiTheme="majorHAnsi" w:eastAsiaTheme="majorEastAsia" w:hAnsiTheme="majorHAnsi" w:cstheme="majorBidi" w:ascii="Times New Roman" w:hAnsi="Times New Roman" w:eastAsia="Times New Roman"/>
       <w:b/>
       <w:bCs/>
-      <w:color w:val="16324F"/>
-      <w:sz w:val="28"/>
+      <w:color w:val="000000"/>
+      <w:sz w:val="24"/>
       <w:szCs w:val="28"/>
     </w:rPr>
   </w:style>
@@ -2492,13 +2676,14 @@
       <w:keepNext/>
       <w:keepLines/>
       <w:spacing w:before="200" w:after="0" w:line="480" w:lineRule="auto"/>
+      <w:jc w:val="left"/>
       <w:outlineLvl w:val="1"/>
     </w:pPr>
     <w:rPr>
       <w:rFonts w:asciiTheme="majorHAnsi" w:eastAsiaTheme="majorEastAsia" w:hAnsiTheme="majorHAnsi" w:cstheme="majorBidi" w:ascii="Times New Roman" w:hAnsi="Times New Roman" w:eastAsia="Times New Roman"/>
       <w:b/>
       <w:bCs/>
-      <w:color w:val="16324F"/>
+      <w:color w:val="000000"/>
       <w:sz w:val="24"/>
       <w:szCs w:val="26"/>
     </w:rPr>
@@ -2761,10 +2946,10 @@
     </w:pPr>
     <w:rPr>
       <w:rFonts w:asciiTheme="majorHAnsi" w:eastAsiaTheme="majorEastAsia" w:hAnsiTheme="majorHAnsi" w:cstheme="majorBidi" w:ascii="Times New Roman" w:hAnsi="Times New Roman" w:eastAsia="Times New Roman"/>
-      <w:color w:val="16324F"/>
+      <w:color w:val="000000"/>
       <w:spacing w:val="5"/>
       <w:kern w:val="28"/>
-      <w:sz w:val="32"/>
+      <w:sz w:val="24"/>
       <w:szCs w:val="52"/>
     </w:rPr>
   </w:style>

</xml_diff>

<commit_message>
docs: reorder APA title pages and remove headers
</commit_message>
<xml_diff>
--- a/documentation/Capstone_Report_Chapters_4_5_6.docx
+++ b/documentation/Capstone_Report_Chapters_4_5_6.docx
@@ -10,6 +10,22 @@
       </w:pPr>
       <w:r>
         <w:rPr>
+          <w:rFonts w:ascii="Times New Roman" w:hAnsi="Times New Roman"/>
+          <w:b w:val="0"/>
+          <w:sz w:val="24"/>
+        </w:rPr>
+        <w:t>Desta Jomma</w:t>
+      </w:r>
+    </w:p>
+    <w:p>
+      <w:pPr>
+        <w:pStyle w:val="Title"/>
+        <w:spacing w:line="480" w:lineRule="auto" w:after="0"/>
+        <w:jc w:val="center"/>
+      </w:pPr>
+      <w:r>
+        <w:rPr>
+          <w:rFonts w:ascii="Times New Roman" w:hAnsi="Times New Roman"/>
           <w:b/>
           <w:sz w:val="24"/>
         </w:rPr>
@@ -18,19 +34,15 @@
     </w:p>
     <w:p>
       <w:pPr>
-        <w:spacing w:line="480" w:lineRule="auto"/>
+        <w:spacing w:line="480" w:lineRule="auto" w:after="0"/>
         <w:jc w:val="center"/>
       </w:pPr>
       <w:r>
-        <w:t>Desta Jomma</w:t>
-      </w:r>
-    </w:p>
-    <w:p>
-      <w:pPr>
-        <w:spacing w:line="480" w:lineRule="auto"/>
-        <w:jc w:val="center"/>
-      </w:pPr>
-      <w:r>
+        <w:rPr>
+          <w:rFonts w:ascii="Times New Roman" w:hAnsi="Times New Roman"/>
+          <w:b w:val="0"/>
+          <w:sz w:val="24"/>
+        </w:rPr>
         <w:t>MSIT 5910-01 - AY2027-T1</w:t>
       </w:r>
     </w:p>
@@ -2192,6 +2204,8 @@
     </w:p>
     <w:sectPr>
       <w:headerReference w:type="default" r:id="rId28"/>
+      <w:headerReference w:type="first" r:id="rId29"/>
+      <w:headerReference w:type="even" r:id="rId30"/>
       <w:pgSz w:w="12240" w:h="15840"/>
       <w:pgMar w:top="1440" w:right="1440" w:bottom="1440" w:left="1440" w:header="720" w:footer="720" w:gutter="0"/>
       <w:cols w:space="720"/>
@@ -2208,17 +2222,26 @@
       <w:pStyle w:val="Header"/>
       <w:jc w:val="right"/>
     </w:pPr>
-    <w:r>
-      <w:rPr>
-        <w:rFonts w:ascii="Times New Roman" w:hAnsi="Times New Roman"/>
-        <w:sz w:val="24"/>
-      </w:rPr>
-      <w:fldChar w:fldCharType="begin"/>
-      <w:instrText xml:space="preserve"> PAGE </w:instrText>
-      <w:fldChar w:fldCharType="separate"/>
-      <w:t>1</w:t>
-      <w:fldChar w:fldCharType="end"/>
-    </w:r>
+  </w:p>
+</w:hdr>
+</file>
+
+<file path=word/header2.xml><?xml version="1.0" encoding="utf-8"?>
+<w:hdr xmlns:m="http://schemas.openxmlformats.org/officeDocument/2006/math" xmlns:mc="http://schemas.openxmlformats.org/markup-compatibility/2006" xmlns:mo="http://schemas.microsoft.com/office/mac/office/2008/main" xmlns:mv="urn:schemas-microsoft-com:mac:vml" xmlns:o="urn:schemas-microsoft-com:office:office" xmlns:r="http://schemas.openxmlformats.org/officeDocument/2006/relationships" xmlns:v="urn:schemas-microsoft-com:vml" xmlns:w10="urn:schemas-microsoft-com:office:word" xmlns:w14="http://schemas.microsoft.com/office/word/2010/wordml" xmlns:w="http://schemas.openxmlformats.org/wordprocessingml/2006/main" xmlns:wne="http://schemas.microsoft.com/office/word/2006/wordml" xmlns:wp14="http://schemas.microsoft.com/office/word/2010/wordprocessingDrawing" xmlns:wp="http://schemas.openxmlformats.org/drawingml/2006/wordprocessingDrawing" xmlns:wpc="http://schemas.microsoft.com/office/word/2010/wordprocessingCanvas" xmlns:wpg="http://schemas.microsoft.com/office/word/2010/wordprocessingGroup" xmlns:wpi="http://schemas.microsoft.com/office/word/2010/wordprocessingInk" xmlns:wps="http://schemas.microsoft.com/office/word/2010/wordprocessingShape" mc:Ignorable="w14 wp14">
+  <w:p>
+    <w:pPr>
+      <w:pStyle w:val="Header"/>
+    </w:pPr>
+  </w:p>
+</w:hdr>
+</file>
+
+<file path=word/header3.xml><?xml version="1.0" encoding="utf-8"?>
+<w:hdr xmlns:m="http://schemas.openxmlformats.org/officeDocument/2006/math" xmlns:mc="http://schemas.openxmlformats.org/markup-compatibility/2006" xmlns:mo="http://schemas.microsoft.com/office/mac/office/2008/main" xmlns:mv="urn:schemas-microsoft-com:mac:vml" xmlns:o="urn:schemas-microsoft-com:office:office" xmlns:r="http://schemas.openxmlformats.org/officeDocument/2006/relationships" xmlns:v="urn:schemas-microsoft-com:vml" xmlns:w10="urn:schemas-microsoft-com:office:word" xmlns:w14="http://schemas.microsoft.com/office/word/2010/wordml" xmlns:w="http://schemas.openxmlformats.org/wordprocessingml/2006/main" xmlns:wne="http://schemas.microsoft.com/office/word/2006/wordml" xmlns:wp14="http://schemas.microsoft.com/office/word/2010/wordprocessingDrawing" xmlns:wp="http://schemas.openxmlformats.org/drawingml/2006/wordprocessingDrawing" xmlns:wpc="http://schemas.microsoft.com/office/word/2010/wordprocessingCanvas" xmlns:wpg="http://schemas.microsoft.com/office/word/2010/wordprocessingGroup" xmlns:wpi="http://schemas.microsoft.com/office/word/2010/wordprocessingInk" xmlns:wps="http://schemas.microsoft.com/office/word/2010/wordprocessingShape" mc:Ignorable="w14 wp14">
+  <w:p>
+    <w:pPr>
+      <w:pStyle w:val="Header"/>
+    </w:pPr>
   </w:p>
 </w:hdr>
 </file>

</xml_diff>

<commit_message>
docs: remove underline styling from reports
</commit_message>
<xml_diff>
--- a/documentation/Capstone_Report_Chapters_4_5_6.docx
+++ b/documentation/Capstone_Report_Chapters_4_5_6.docx
@@ -1897,7 +1897,6 @@
         <w:r>
           <w:rPr>
             <w:color w:val="0563C1"/>
-            <w:u w:val="single"/>
             <w:rFonts w:ascii="Times New Roman" w:hAnsi="Times New Roman"/>
             <w:sz w:val="24"/>
           </w:rPr>
@@ -1921,7 +1920,6 @@
         <w:r>
           <w:rPr>
             <w:color w:val="0563C1"/>
-            <w:u w:val="single"/>
             <w:rFonts w:ascii="Times New Roman" w:hAnsi="Times New Roman"/>
             <w:sz w:val="24"/>
           </w:rPr>
@@ -1945,7 +1943,6 @@
         <w:r>
           <w:rPr>
             <w:color w:val="0563C1"/>
-            <w:u w:val="single"/>
             <w:rFonts w:ascii="Times New Roman" w:hAnsi="Times New Roman"/>
             <w:sz w:val="24"/>
           </w:rPr>
@@ -1965,7 +1962,6 @@
         <w:r>
           <w:rPr>
             <w:color w:val="0563C1"/>
-            <w:u w:val="single"/>
             <w:rFonts w:ascii="Times New Roman" w:hAnsi="Times New Roman"/>
             <w:sz w:val="24"/>
           </w:rPr>
@@ -1989,7 +1985,6 @@
         <w:r>
           <w:rPr>
             <w:color w:val="0563C1"/>
-            <w:u w:val="single"/>
             <w:rFonts w:ascii="Times New Roman" w:hAnsi="Times New Roman"/>
             <w:sz w:val="24"/>
           </w:rPr>
@@ -2013,7 +2008,6 @@
         <w:r>
           <w:rPr>
             <w:color w:val="0563C1"/>
-            <w:u w:val="single"/>
             <w:rFonts w:ascii="Times New Roman" w:hAnsi="Times New Roman"/>
             <w:sz w:val="24"/>
           </w:rPr>
@@ -2037,7 +2031,6 @@
         <w:r>
           <w:rPr>
             <w:color w:val="0563C1"/>
-            <w:u w:val="single"/>
             <w:rFonts w:ascii="Times New Roman" w:hAnsi="Times New Roman"/>
             <w:sz w:val="24"/>
           </w:rPr>
@@ -2061,7 +2054,6 @@
         <w:r>
           <w:rPr>
             <w:color w:val="0563C1"/>
-            <w:u w:val="single"/>
             <w:rFonts w:ascii="Times New Roman" w:hAnsi="Times New Roman"/>
             <w:sz w:val="24"/>
           </w:rPr>
@@ -2085,7 +2077,6 @@
         <w:r>
           <w:rPr>
             <w:color w:val="0563C1"/>
-            <w:u w:val="single"/>
             <w:rFonts w:ascii="Times New Roman" w:hAnsi="Times New Roman"/>
             <w:sz w:val="24"/>
           </w:rPr>
@@ -2109,7 +2100,6 @@
         <w:r>
           <w:rPr>
             <w:color w:val="0563C1"/>
-            <w:u w:val="single"/>
             <w:rFonts w:ascii="Times New Roman" w:hAnsi="Times New Roman"/>
             <w:sz w:val="24"/>
           </w:rPr>
@@ -2133,7 +2123,6 @@
         <w:r>
           <w:rPr>
             <w:color w:val="0563C1"/>
-            <w:u w:val="single"/>
             <w:rFonts w:ascii="Times New Roman" w:hAnsi="Times New Roman"/>
             <w:sz w:val="24"/>
           </w:rPr>
@@ -2170,7 +2159,6 @@
         <w:r>
           <w:rPr>
             <w:color w:val="0563C1"/>
-            <w:u w:val="single"/>
             <w:rFonts w:ascii="Times New Roman" w:hAnsi="Times New Roman"/>
             <w:sz w:val="24"/>
           </w:rPr>
@@ -2194,7 +2182,6 @@
         <w:r>
           <w:rPr>
             <w:color w:val="0563C1"/>
-            <w:u w:val="single"/>
             <w:rFonts w:ascii="Times New Roman" w:hAnsi="Times New Roman"/>
             <w:sz w:val="24"/>
           </w:rPr>
@@ -2206,6 +2193,8 @@
       <w:headerReference w:type="default" r:id="rId28"/>
       <w:headerReference w:type="first" r:id="rId29"/>
       <w:headerReference w:type="even" r:id="rId30"/>
+      <w:footerReference w:type="default" r:id="rId31"/>
+      <w:footerReference w:type="first" r:id="rId32"/>
       <w:pgSz w:w="12240" w:h="15840"/>
       <w:pgMar w:top="1440" w:right="1440" w:bottom="1440" w:left="1440" w:header="720" w:footer="720" w:gutter="0"/>
       <w:cols w:space="720"/>
@@ -2213,6 +2202,26 @@
     </w:sectPr>
   </w:body>
 </w:document>
+</file>
+
+<file path=word/footer1.xml><?xml version="1.0" encoding="utf-8"?>
+<w:ftr xmlns:m="http://schemas.openxmlformats.org/officeDocument/2006/math" xmlns:mc="http://schemas.openxmlformats.org/markup-compatibility/2006" xmlns:mo="http://schemas.microsoft.com/office/mac/office/2008/main" xmlns:mv="urn:schemas-microsoft-com:mac:vml" xmlns:o="urn:schemas-microsoft-com:office:office" xmlns:r="http://schemas.openxmlformats.org/officeDocument/2006/relationships" xmlns:v="urn:schemas-microsoft-com:vml" xmlns:w10="urn:schemas-microsoft-com:office:word" xmlns:w14="http://schemas.microsoft.com/office/word/2010/wordml" xmlns:w="http://schemas.openxmlformats.org/wordprocessingml/2006/main" xmlns:wne="http://schemas.microsoft.com/office/word/2006/wordml" xmlns:wp14="http://schemas.microsoft.com/office/word/2010/wordprocessingDrawing" xmlns:wp="http://schemas.openxmlformats.org/drawingml/2006/wordprocessingDrawing" xmlns:wpc="http://schemas.microsoft.com/office/word/2010/wordprocessingCanvas" xmlns:wpg="http://schemas.microsoft.com/office/word/2010/wordprocessingGroup" xmlns:wpi="http://schemas.microsoft.com/office/word/2010/wordprocessingInk" xmlns:wps="http://schemas.microsoft.com/office/word/2010/wordprocessingShape" mc:Ignorable="w14 wp14">
+  <w:p>
+    <w:pPr>
+      <w:pStyle w:val="Footer"/>
+    </w:pPr>
+  </w:p>
+</w:ftr>
+</file>
+
+<file path=word/footer2.xml><?xml version="1.0" encoding="utf-8"?>
+<w:ftr xmlns:m="http://schemas.openxmlformats.org/officeDocument/2006/math" xmlns:mc="http://schemas.openxmlformats.org/markup-compatibility/2006" xmlns:mo="http://schemas.microsoft.com/office/mac/office/2008/main" xmlns:mv="urn:schemas-microsoft-com:mac:vml" xmlns:o="urn:schemas-microsoft-com:office:office" xmlns:r="http://schemas.openxmlformats.org/officeDocument/2006/relationships" xmlns:v="urn:schemas-microsoft-com:vml" xmlns:w10="urn:schemas-microsoft-com:office:word" xmlns:w14="http://schemas.microsoft.com/office/word/2010/wordml" xmlns:w="http://schemas.openxmlformats.org/wordprocessingml/2006/main" xmlns:wne="http://schemas.microsoft.com/office/word/2006/wordml" xmlns:wp14="http://schemas.microsoft.com/office/word/2010/wordprocessingDrawing" xmlns:wp="http://schemas.openxmlformats.org/drawingml/2006/wordprocessingDrawing" xmlns:wpc="http://schemas.microsoft.com/office/word/2010/wordprocessingCanvas" xmlns:wpg="http://schemas.microsoft.com/office/word/2010/wordprocessingGroup" xmlns:wpi="http://schemas.microsoft.com/office/word/2010/wordprocessingInk" xmlns:wps="http://schemas.microsoft.com/office/word/2010/wordprocessingShape" mc:Ignorable="w14 wp14">
+  <w:p>
+    <w:pPr>
+      <w:pStyle w:val="Footer"/>
+    </w:pPr>
+  </w:p>
+</w:ftr>
 </file>
 
 <file path=word/header1.xml><?xml version="1.0" encoding="utf-8"?>

</xml_diff>

<commit_message>
docs: remove inherited title-page line styling
</commit_message>
<xml_diff>
--- a/documentation/Capstone_Report_Chapters_4_5_6.docx
+++ b/documentation/Capstone_Report_Chapters_4_5_6.docx
@@ -4,7 +4,6 @@
   <w:body>
     <w:p>
       <w:pPr>
-        <w:pStyle w:val="Title"/>
         <w:spacing w:line="480" w:lineRule="auto" w:before="1800" w:after="0"/>
         <w:jc w:val="center"/>
       </w:pPr>
@@ -12,6 +11,7 @@
         <w:rPr>
           <w:rFonts w:ascii="Times New Roman" w:hAnsi="Times New Roman"/>
           <w:b w:val="0"/>
+          <w:color w:val="000000"/>
           <w:sz w:val="24"/>
         </w:rPr>
         <w:t>Desta Jomma</w:t>
@@ -19,7 +19,6 @@
     </w:p>
     <w:p>
       <w:pPr>
-        <w:pStyle w:val="Title"/>
         <w:spacing w:line="480" w:lineRule="auto" w:after="0"/>
         <w:jc w:val="center"/>
       </w:pPr>
@@ -27,6 +26,7 @@
         <w:rPr>
           <w:rFonts w:ascii="Times New Roman" w:hAnsi="Times New Roman"/>
           <w:b/>
+          <w:color w:val="000000"/>
           <w:sz w:val="24"/>
         </w:rPr>
         <w:t>SafeSteps Capstone Project Report Chapters Four to Six</w:t>
@@ -41,6 +41,7 @@
         <w:rPr>
           <w:rFonts w:ascii="Times New Roman" w:hAnsi="Times New Roman"/>
           <w:b w:val="0"/>
+          <w:color w:val="000000"/>
           <w:sz w:val="24"/>
         </w:rPr>
         <w:t>MSIT 5910-01 - AY2027-T1</w:t>
@@ -2641,6 +2642,7 @@
       </w:tabs>
       <w:spacing w:after="0" w:line="240" w:lineRule="auto"/>
     </w:pPr>
+    <w:rPr/>
   </w:style>
   <w:style w:type="character" w:customStyle="1" w:styleId="HeaderChar">
     <w:name w:val="Header Char"/>
@@ -2648,6 +2650,7 @@
     <w:link w:val="Header"/>
     <w:uiPriority w:val="99"/>
     <w:rsid w:val="00E618BF"/>
+    <w:rPr/>
   </w:style>
   <w:style w:type="paragraph" w:styleId="Footer">
     <w:name w:val="footer"/>
@@ -2663,6 +2666,7 @@
       </w:tabs>
       <w:spacing w:after="0" w:line="240" w:lineRule="auto"/>
     </w:pPr>
+    <w:rPr/>
   </w:style>
   <w:style w:type="character" w:customStyle="1" w:styleId="FooterChar">
     <w:name w:val="Footer Char"/>
@@ -2670,6 +2674,7 @@
     <w:link w:val="Footer"/>
     <w:uiPriority w:val="99"/>
     <w:rsid w:val="00E618BF"/>
+    <w:rPr/>
   </w:style>
   <w:style w:type="paragraph" w:styleId="Heading1">
     <w:name w:val="heading 1"/>
@@ -2887,12 +2892,14 @@
     <w:uiPriority w:val="1"/>
     <w:semiHidden/>
     <w:unhideWhenUsed/>
+    <w:rPr/>
   </w:style>
   <w:style w:type="table" w:default="1" w:styleId="TableNormal">
     <w:name w:val="Normal Table"/>
     <w:uiPriority w:val="99"/>
     <w:semiHidden/>
     <w:unhideWhenUsed/>
+    <w:rPr/>
     <w:tblPr>
       <w:tblInd w:w="0" w:type="dxa"/>
       <w:tblCellMar>
@@ -2917,6 +2924,7 @@
     <w:pPr>
       <w:spacing w:after="0" w:line="240" w:lineRule="auto"/>
     </w:pPr>
+    <w:rPr/>
   </w:style>
   <w:style w:type="character" w:customStyle="1" w:styleId="Heading1Char">
     <w:name w:val="Heading 1 Char"/>
@@ -2970,9 +2978,6 @@
     <w:qFormat/>
     <w:rsid w:val="00FC693F"/>
     <w:pPr>
-      <w:pBdr>
-        <w:bottom w:val="single" w:sz="8" w:space="4" w:color="4F81BD" w:themeColor="accent1"/>
-      </w:pBdr>
       <w:spacing w:after="0" w:line="480" w:lineRule="auto"/>
       <w:contextualSpacing/>
     </w:pPr>
@@ -3049,6 +3054,7 @@
       <w:ind w:left="720"/>
       <w:contextualSpacing/>
     </w:pPr>
+    <w:rPr/>
   </w:style>
   <w:style w:type="paragraph" w:styleId="BodyText">
     <w:name w:val="Body Text"/>
@@ -3060,6 +3066,7 @@
     <w:pPr>
       <w:spacing w:after="120"/>
     </w:pPr>
+    <w:rPr/>
   </w:style>
   <w:style w:type="character" w:customStyle="1" w:styleId="BodyTextChar">
     <w:name w:val="Body Text Char"/>
@@ -3067,6 +3074,7 @@
     <w:link w:val="BodyText"/>
     <w:uiPriority w:val="99"/>
     <w:rsid w:val="00AA1D8D"/>
+    <w:rPr/>
   </w:style>
   <w:style w:type="paragraph" w:styleId="BodyText2">
     <w:name w:val="Body Text 2"/>
@@ -3078,6 +3086,7 @@
     <w:pPr>
       <w:spacing w:after="120" w:line="480" w:lineRule="auto"/>
     </w:pPr>
+    <w:rPr/>
   </w:style>
   <w:style w:type="character" w:customStyle="1" w:styleId="BodyText2Char">
     <w:name w:val="Body Text 2 Char"/>
@@ -3085,6 +3094,7 @@
     <w:link w:val="BodyText2"/>
     <w:uiPriority w:val="99"/>
     <w:rsid w:val="00AA1D8D"/>
+    <w:rPr/>
   </w:style>
   <w:style w:type="paragraph" w:styleId="BodyText3">
     <w:name w:val="Body Text 3"/>
@@ -3122,6 +3132,7 @@
       <w:ind w:left="360" w:hanging="360"/>
       <w:contextualSpacing/>
     </w:pPr>
+    <w:rPr/>
   </w:style>
   <w:style w:type="paragraph" w:styleId="List2">
     <w:name w:val="List 2"/>
@@ -3133,6 +3144,7 @@
       <w:ind w:left="720" w:hanging="360"/>
       <w:contextualSpacing/>
     </w:pPr>
+    <w:rPr/>
   </w:style>
   <w:style w:type="paragraph" w:styleId="List3">
     <w:name w:val="List 3"/>
@@ -3144,6 +3156,7 @@
       <w:ind w:left="1080" w:hanging="360"/>
       <w:contextualSpacing/>
     </w:pPr>
+    <w:rPr/>
   </w:style>
   <w:style w:type="paragraph" w:styleId="ListBullet">
     <w:name w:val="List Bullet"/>
@@ -3157,6 +3170,7 @@
       </w:numPr>
       <w:contextualSpacing/>
     </w:pPr>
+    <w:rPr/>
   </w:style>
   <w:style w:type="paragraph" w:styleId="ListBullet2">
     <w:name w:val="List Bullet 2"/>
@@ -3170,6 +3184,7 @@
       </w:numPr>
       <w:contextualSpacing/>
     </w:pPr>
+    <w:rPr/>
   </w:style>
   <w:style w:type="paragraph" w:styleId="ListBullet3">
     <w:name w:val="List Bullet 3"/>
@@ -3183,6 +3198,7 @@
       </w:numPr>
       <w:contextualSpacing/>
     </w:pPr>
+    <w:rPr/>
   </w:style>
   <w:style w:type="paragraph" w:styleId="ListNumber">
     <w:name w:val="List Number"/>
@@ -3196,6 +3212,7 @@
       </w:numPr>
       <w:contextualSpacing/>
     </w:pPr>
+    <w:rPr/>
   </w:style>
   <w:style w:type="paragraph" w:styleId="ListNumber2">
     <w:name w:val="List Number 2"/>
@@ -3209,6 +3226,7 @@
       </w:numPr>
       <w:contextualSpacing/>
     </w:pPr>
+    <w:rPr/>
   </w:style>
   <w:style w:type="paragraph" w:styleId="ListNumber3">
     <w:name w:val="List Number 3"/>
@@ -3222,6 +3240,7 @@
       </w:numPr>
       <w:contextualSpacing/>
     </w:pPr>
+    <w:rPr/>
   </w:style>
   <w:style w:type="paragraph" w:styleId="ListContinue">
     <w:name w:val="List Continue"/>
@@ -3234,6 +3253,7 @@
       <w:ind w:left="360"/>
       <w:contextualSpacing/>
     </w:pPr>
+    <w:rPr/>
   </w:style>
   <w:style w:type="paragraph" w:styleId="ListContinue2">
     <w:name w:val="List Continue 2"/>
@@ -3246,6 +3266,7 @@
       <w:ind w:left="720"/>
       <w:contextualSpacing/>
     </w:pPr>
+    <w:rPr/>
   </w:style>
   <w:style w:type="paragraph" w:styleId="ListContinue3">
     <w:name w:val="List Continue 3"/>
@@ -3258,6 +3279,7 @@
       <w:ind w:left="1080"/>
       <w:contextualSpacing/>
     </w:pPr>
+    <w:rPr/>
   </w:style>
   <w:style w:type="paragraph" w:styleId="MacroText">
     <w:name w:val="macro"/>
@@ -3457,9 +3479,6 @@
     <w:qFormat/>
     <w:rsid w:val="00FC693F"/>
     <w:pPr>
-      <w:pBdr>
-        <w:bottom w:val="single" w:sz="4" w:space="4" w:color="4F81BD" w:themeColor="accent1"/>
-      </w:pBdr>
       <w:spacing w:before="200" w:after="280"/>
       <w:ind w:left="936" w:right="936"/>
     </w:pPr>
@@ -3520,7 +3539,6 @@
     <w:rPr>
       <w:smallCaps/>
       <w:color w:val="C0504D" w:themeColor="accent2"/>
-      <w:u w:val="single"/>
     </w:rPr>
   </w:style>
   <w:style w:type="character" w:styleId="IntenseReference">
@@ -3535,7 +3553,6 @@
       <w:smallCaps/>
       <w:color w:val="C0504D" w:themeColor="accent2"/>
       <w:spacing w:val="5"/>
-      <w:u w:val="single"/>
     </w:rPr>
   </w:style>
   <w:style w:type="character" w:styleId="BookTitle">
@@ -3563,6 +3580,7 @@
     <w:pPr>
       <w:outlineLvl w:val="9"/>
     </w:pPr>
+    <w:rPr/>
   </w:style>
   <w:style w:type="table" w:styleId="TableGrid">
     <w:name w:val="Table Grid"/>
@@ -3572,6 +3590,7 @@
     <w:pPr>
       <w:spacing w:after="0" w:line="240" w:lineRule="auto"/>
     </w:pPr>
+    <w:rPr/>
     <w:tblPr>
       <w:tblInd w:w="0" w:type="dxa"/>
       <w:tblBorders>
@@ -4319,6 +4338,7 @@
     <w:pPr>
       <w:spacing w:after="0" w:line="240" w:lineRule="auto"/>
     </w:pPr>
+    <w:rPr/>
     <w:tblPr>
       <w:tblStyleRowBandSize w:val="1"/>
       <w:tblStyleColBandSize w:val="1"/>
@@ -4411,6 +4431,7 @@
     <w:pPr>
       <w:spacing w:after="0" w:line="240" w:lineRule="auto"/>
     </w:pPr>
+    <w:rPr/>
     <w:tblPr>
       <w:tblStyleRowBandSize w:val="1"/>
       <w:tblStyleColBandSize w:val="1"/>
@@ -4503,6 +4524,7 @@
     <w:pPr>
       <w:spacing w:after="0" w:line="240" w:lineRule="auto"/>
     </w:pPr>
+    <w:rPr/>
     <w:tblPr>
       <w:tblStyleRowBandSize w:val="1"/>
       <w:tblStyleColBandSize w:val="1"/>
@@ -4595,6 +4617,7 @@
     <w:pPr>
       <w:spacing w:after="0" w:line="240" w:lineRule="auto"/>
     </w:pPr>
+    <w:rPr/>
     <w:tblPr>
       <w:tblStyleRowBandSize w:val="1"/>
       <w:tblStyleColBandSize w:val="1"/>
@@ -4687,6 +4710,7 @@
     <w:pPr>
       <w:spacing w:after="0" w:line="240" w:lineRule="auto"/>
     </w:pPr>
+    <w:rPr/>
     <w:tblPr>
       <w:tblStyleRowBandSize w:val="1"/>
       <w:tblStyleColBandSize w:val="1"/>
@@ -4779,6 +4803,7 @@
     <w:pPr>
       <w:spacing w:after="0" w:line="240" w:lineRule="auto"/>
     </w:pPr>
+    <w:rPr/>
     <w:tblPr>
       <w:tblStyleRowBandSize w:val="1"/>
       <w:tblStyleColBandSize w:val="1"/>
@@ -4871,6 +4896,7 @@
     <w:pPr>
       <w:spacing w:after="0" w:line="240" w:lineRule="auto"/>
     </w:pPr>
+    <w:rPr/>
     <w:tblPr>
       <w:tblStyleRowBandSize w:val="1"/>
       <w:tblStyleColBandSize w:val="1"/>
@@ -4963,6 +4989,7 @@
     <w:pPr>
       <w:spacing w:after="0" w:line="240" w:lineRule="auto"/>
     </w:pPr>
+    <w:rPr/>
     <w:tblPr>
       <w:tblStyleRowBandSize w:val="1"/>
       <w:tblStyleColBandSize w:val="1"/>
@@ -5093,6 +5120,7 @@
     <w:pPr>
       <w:spacing w:after="0" w:line="240" w:lineRule="auto"/>
     </w:pPr>
+    <w:rPr/>
     <w:tblPr>
       <w:tblStyleRowBandSize w:val="1"/>
       <w:tblStyleColBandSize w:val="1"/>
@@ -5223,6 +5251,7 @@
     <w:pPr>
       <w:spacing w:after="0" w:line="240" w:lineRule="auto"/>
     </w:pPr>
+    <w:rPr/>
     <w:tblPr>
       <w:tblStyleRowBandSize w:val="1"/>
       <w:tblStyleColBandSize w:val="1"/>
@@ -5353,6 +5382,7 @@
     <w:pPr>
       <w:spacing w:after="0" w:line="240" w:lineRule="auto"/>
     </w:pPr>
+    <w:rPr/>
     <w:tblPr>
       <w:tblStyleRowBandSize w:val="1"/>
       <w:tblStyleColBandSize w:val="1"/>
@@ -5483,6 +5513,7 @@
     <w:pPr>
       <w:spacing w:after="0" w:line="240" w:lineRule="auto"/>
     </w:pPr>
+    <w:rPr/>
     <w:tblPr>
       <w:tblStyleRowBandSize w:val="1"/>
       <w:tblStyleColBandSize w:val="1"/>
@@ -5613,6 +5644,7 @@
     <w:pPr>
       <w:spacing w:after="0" w:line="240" w:lineRule="auto"/>
     </w:pPr>
+    <w:rPr/>
     <w:tblPr>
       <w:tblStyleRowBandSize w:val="1"/>
       <w:tblStyleColBandSize w:val="1"/>
@@ -5743,6 +5775,7 @@
     <w:pPr>
       <w:spacing w:after="0" w:line="240" w:lineRule="auto"/>
     </w:pPr>
+    <w:rPr/>
     <w:tblPr>
       <w:tblStyleRowBandSize w:val="1"/>
       <w:tblStyleColBandSize w:val="1"/>
@@ -5873,6 +5906,7 @@
     <w:pPr>
       <w:spacing w:after="0" w:line="240" w:lineRule="auto"/>
     </w:pPr>
+    <w:rPr/>
     <w:tblPr>
       <w:tblStyleRowBandSize w:val="1"/>
       <w:tblStyleColBandSize w:val="1"/>
@@ -5979,6 +6013,7 @@
     <w:pPr>
       <w:spacing w:after="0" w:line="240" w:lineRule="auto"/>
     </w:pPr>
+    <w:rPr/>
     <w:tblPr>
       <w:tblStyleRowBandSize w:val="1"/>
       <w:tblStyleColBandSize w:val="1"/>
@@ -6085,6 +6120,7 @@
     <w:pPr>
       <w:spacing w:after="0" w:line="240" w:lineRule="auto"/>
     </w:pPr>
+    <w:rPr/>
     <w:tblPr>
       <w:tblStyleRowBandSize w:val="1"/>
       <w:tblStyleColBandSize w:val="1"/>
@@ -6191,6 +6227,7 @@
     <w:pPr>
       <w:spacing w:after="0" w:line="240" w:lineRule="auto"/>
     </w:pPr>
+    <w:rPr/>
     <w:tblPr>
       <w:tblStyleRowBandSize w:val="1"/>
       <w:tblStyleColBandSize w:val="1"/>
@@ -6297,6 +6334,7 @@
     <w:pPr>
       <w:spacing w:after="0" w:line="240" w:lineRule="auto"/>
     </w:pPr>
+    <w:rPr/>
     <w:tblPr>
       <w:tblStyleRowBandSize w:val="1"/>
       <w:tblStyleColBandSize w:val="1"/>
@@ -6403,6 +6441,7 @@
     <w:pPr>
       <w:spacing w:after="0" w:line="240" w:lineRule="auto"/>
     </w:pPr>
+    <w:rPr/>
     <w:tblPr>
       <w:tblStyleRowBandSize w:val="1"/>
       <w:tblStyleColBandSize w:val="1"/>
@@ -6509,6 +6548,7 @@
     <w:pPr>
       <w:spacing w:after="0" w:line="240" w:lineRule="auto"/>
     </w:pPr>
+    <w:rPr/>
     <w:tblPr>
       <w:tblStyleRowBandSize w:val="1"/>
       <w:tblStyleColBandSize w:val="1"/>
@@ -6615,6 +6655,7 @@
     <w:pPr>
       <w:spacing w:after="0" w:line="240" w:lineRule="auto"/>
     </w:pPr>
+    <w:rPr/>
     <w:tblPr>
       <w:tblStyleRowBandSize w:val="1"/>
       <w:tblStyleColBandSize w:val="1"/>
@@ -6764,6 +6805,7 @@
     <w:pPr>
       <w:spacing w:after="0" w:line="240" w:lineRule="auto"/>
     </w:pPr>
+    <w:rPr/>
     <w:tblPr>
       <w:tblStyleRowBandSize w:val="1"/>
       <w:tblStyleColBandSize w:val="1"/>
@@ -6913,6 +6955,7 @@
     <w:pPr>
       <w:spacing w:after="0" w:line="240" w:lineRule="auto"/>
     </w:pPr>
+    <w:rPr/>
     <w:tblPr>
       <w:tblStyleRowBandSize w:val="1"/>
       <w:tblStyleColBandSize w:val="1"/>
@@ -7062,6 +7105,7 @@
     <w:pPr>
       <w:spacing w:after="0" w:line="240" w:lineRule="auto"/>
     </w:pPr>
+    <w:rPr/>
     <w:tblPr>
       <w:tblStyleRowBandSize w:val="1"/>
       <w:tblStyleColBandSize w:val="1"/>
@@ -7211,6 +7255,7 @@
     <w:pPr>
       <w:spacing w:after="0" w:line="240" w:lineRule="auto"/>
     </w:pPr>
+    <w:rPr/>
     <w:tblPr>
       <w:tblStyleRowBandSize w:val="1"/>
       <w:tblStyleColBandSize w:val="1"/>
@@ -7360,6 +7405,7 @@
     <w:pPr>
       <w:spacing w:after="0" w:line="240" w:lineRule="auto"/>
     </w:pPr>
+    <w:rPr/>
     <w:tblPr>
       <w:tblStyleRowBandSize w:val="1"/>
       <w:tblStyleColBandSize w:val="1"/>
@@ -7509,6 +7555,7 @@
     <w:pPr>
       <w:spacing w:after="0" w:line="240" w:lineRule="auto"/>
     </w:pPr>
+    <w:rPr/>
     <w:tblPr>
       <w:tblStyleRowBandSize w:val="1"/>
       <w:tblStyleColBandSize w:val="1"/>
@@ -9142,6 +9189,7 @@
     <w:pPr>
       <w:spacing w:after="0" w:line="240" w:lineRule="auto"/>
     </w:pPr>
+    <w:rPr/>
     <w:tblPr>
       <w:tblStyleRowBandSize w:val="1"/>
       <w:tblStyleColBandSize w:val="1"/>
@@ -9215,6 +9263,7 @@
     <w:pPr>
       <w:spacing w:after="0" w:line="240" w:lineRule="auto"/>
     </w:pPr>
+    <w:rPr/>
     <w:tblPr>
       <w:tblStyleRowBandSize w:val="1"/>
       <w:tblStyleColBandSize w:val="1"/>
@@ -9288,6 +9337,7 @@
     <w:pPr>
       <w:spacing w:after="0" w:line="240" w:lineRule="auto"/>
     </w:pPr>
+    <w:rPr/>
     <w:tblPr>
       <w:tblStyleRowBandSize w:val="1"/>
       <w:tblStyleColBandSize w:val="1"/>
@@ -9361,6 +9411,7 @@
     <w:pPr>
       <w:spacing w:after="0" w:line="240" w:lineRule="auto"/>
     </w:pPr>
+    <w:rPr/>
     <w:tblPr>
       <w:tblStyleRowBandSize w:val="1"/>
       <w:tblStyleColBandSize w:val="1"/>
@@ -9434,6 +9485,7 @@
     <w:pPr>
       <w:spacing w:after="0" w:line="240" w:lineRule="auto"/>
     </w:pPr>
+    <w:rPr/>
     <w:tblPr>
       <w:tblStyleRowBandSize w:val="1"/>
       <w:tblStyleColBandSize w:val="1"/>
@@ -9507,6 +9559,7 @@
     <w:pPr>
       <w:spacing w:after="0" w:line="240" w:lineRule="auto"/>
     </w:pPr>
+    <w:rPr/>
     <w:tblPr>
       <w:tblStyleRowBandSize w:val="1"/>
       <w:tblStyleColBandSize w:val="1"/>
@@ -9580,6 +9633,7 @@
     <w:pPr>
       <w:spacing w:after="0" w:line="240" w:lineRule="auto"/>
     </w:pPr>
+    <w:rPr/>
     <w:tblPr>
       <w:tblStyleRowBandSize w:val="1"/>
       <w:tblStyleColBandSize w:val="1"/>
@@ -10528,6 +10582,7 @@
     <w:pPr>
       <w:spacing w:after="0" w:line="240" w:lineRule="auto"/>
     </w:pPr>
+    <w:rPr/>
     <w:tblPr>
       <w:tblStyleRowBandSize w:val="1"/>
       <w:tblStyleColBandSize w:val="1"/>
@@ -10669,6 +10724,7 @@
     <w:pPr>
       <w:spacing w:after="0" w:line="240" w:lineRule="auto"/>
     </w:pPr>
+    <w:rPr/>
     <w:tblPr>
       <w:tblStyleRowBandSize w:val="1"/>
       <w:tblStyleColBandSize w:val="1"/>
@@ -10810,6 +10866,7 @@
     <w:pPr>
       <w:spacing w:after="0" w:line="240" w:lineRule="auto"/>
     </w:pPr>
+    <w:rPr/>
     <w:tblPr>
       <w:tblStyleRowBandSize w:val="1"/>
       <w:tblStyleColBandSize w:val="1"/>
@@ -10951,6 +11008,7 @@
     <w:pPr>
       <w:spacing w:after="0" w:line="240" w:lineRule="auto"/>
     </w:pPr>
+    <w:rPr/>
     <w:tblPr>
       <w:tblStyleRowBandSize w:val="1"/>
       <w:tblStyleColBandSize w:val="1"/>
@@ -11092,6 +11150,7 @@
     <w:pPr>
       <w:spacing w:after="0" w:line="240" w:lineRule="auto"/>
     </w:pPr>
+    <w:rPr/>
     <w:tblPr>
       <w:tblStyleRowBandSize w:val="1"/>
       <w:tblStyleColBandSize w:val="1"/>
@@ -11233,6 +11292,7 @@
     <w:pPr>
       <w:spacing w:after="0" w:line="240" w:lineRule="auto"/>
     </w:pPr>
+    <w:rPr/>
     <w:tblPr>
       <w:tblStyleRowBandSize w:val="1"/>
       <w:tblStyleColBandSize w:val="1"/>
@@ -11374,6 +11434,7 @@
     <w:pPr>
       <w:spacing w:after="0" w:line="240" w:lineRule="auto"/>
     </w:pPr>
+    <w:rPr/>
     <w:tblPr>
       <w:tblStyleRowBandSize w:val="1"/>
       <w:tblStyleColBandSize w:val="1"/>

</xml_diff>